<commit_message>
Deploying to gh-pages from @ pro4bib/handbuch-it-in-bibliotheken@bb4fd1b4a0f09b20cd2ecdc77851e1fe34374364 🚀
</commit_message>
<xml_diff>
--- a/innentitel_impressum.docx
+++ b/innentitel_impressum.docx
@@ -1,6 +1,6 @@
 
 <file path=word/document.xml><?xml version="1.0" encoding="utf-8"?>
-<w:document xmlns:o="urn:schemas-microsoft-com:office:office" xmlns:r="http://schemas.openxmlformats.org/officeDocument/2006/relationships" xmlns:v="urn:schemas-microsoft-com:vml" xmlns:w="http://schemas.openxmlformats.org/wordprocessingml/2006/main" xmlns:w10="urn:schemas-microsoft-com:office:word" xmlns:wp="http://schemas.openxmlformats.org/drawingml/2006/wordprocessingDrawing" xmlns:wps="http://schemas.microsoft.com/office/word/2010/wordprocessingShape" xmlns:wpg="http://schemas.microsoft.com/office/word/2010/wordprocessingGroup" xmlns:mc="http://schemas.openxmlformats.org/markup-compatibility/2006" xmlns:wp14="http://schemas.microsoft.com/office/word/2010/wordprocessingDrawing" xmlns:w14="http://schemas.microsoft.com/office/word/2010/wordml" xmlns:w15="http://schemas.microsoft.com/office/word/2012/wordml" mc:Ignorable="w14 wp14 w15">
+<w:document xmlns:o="urn:schemas-microsoft-com:office:office" xmlns:r="http://schemas.openxmlformats.org/officeDocument/2006/relationships" xmlns:v="urn:schemas-microsoft-com:vml" xmlns:w="http://schemas.openxmlformats.org/wordprocessingml/2006/main" xmlns:w10="urn:schemas-microsoft-com:office:word" xmlns:wp="http://schemas.openxmlformats.org/drawingml/2006/wordprocessingDrawing" xmlns:pic="http://schemas.openxmlformats.org/drawingml/2006/picture" xmlns:wps="http://schemas.microsoft.com/office/word/2010/wordprocessingShape" xmlns:wpg="http://schemas.microsoft.com/office/word/2010/wordprocessingGroup" xmlns:mc="http://schemas.openxmlformats.org/markup-compatibility/2006" xmlns:wp14="http://schemas.microsoft.com/office/word/2010/wordprocessingDrawing" xmlns:w14="http://schemas.microsoft.com/office/word/2010/wordml" xmlns:w15="http://schemas.microsoft.com/office/word/2012/wordml" mc:Ignorable="w14 wp14 w15">
   <w:body>
     <w:p>
       <w:pPr>
@@ -22,6 +22,12 @@
     </w:p>
     <w:p>
       <w:pPr>
+        <w:pStyle w:val="Normal"/>
+        <w:jc w:val="right"/>
+        <w:rPr>
+          <w:sz w:val="18"/>
+          <w:szCs w:val="18"/>
+        </w:rPr>
         <w:sectPr>
           <w:type w:val="nextPage"/>
           <w:pgSz w:w="9639" w:h="13608"/>
@@ -31,12 +37,6 @@
           <w:textDirection w:val="lrTb"/>
           <w:docGrid w:type="default" w:linePitch="360" w:charSpace="8192"/>
         </w:sectPr>
-        <w:pStyle w:val="Normal"/>
-        <w:jc w:val="right"/>
-        <w:rPr>
-          <w:sz w:val="18"/>
-          <w:szCs w:val="18"/>
-        </w:rPr>
       </w:pPr>
       <w:r>
         <w:rPr>
@@ -59,28 +59,22 @@
         </w:rPr>
       </w:pPr>
       <w:r>
-        <w:rPr/>
-      </w:r>
-    </w:p>
-    <w:p>
-      <w:pPr>
-        <w:pStyle w:val="Normal"/>
+        <w:rPr>
+          <w:rFonts w:cs="Servus Slab SemiBold" w:ascii="Exo 2" w:hAnsi="Exo 2"/>
+          <w:color w:val="FF0000"/>
+          <w:szCs w:val="20"/>
+        </w:rPr>
+      </w:r>
+    </w:p>
+    <w:p>
+      <w:pPr>
+        <w:pStyle w:val="Normal"/>
+        <w:spacing w:before="0" w:after="0"/>
         <w:rPr>
           <w:rFonts w:ascii="Exo 2" w:hAnsi="Exo 2" w:cs="Servus Slab SemiBold"/>
           <w:color w:val="FF0000"/>
           <w:szCs w:val="20"/>
         </w:rPr>
-      </w:pPr>
-      <w:r>
-        <w:rPr>
-          <w:rFonts w:cs="Servus Slab SemiBold" w:ascii="Exo 2" w:hAnsi="Exo 2"/>
-          <w:color w:val="FF0000"/>
-          <w:szCs w:val="20"/>
-        </w:rPr>
-      </w:r>
-    </w:p>
-    <w:p>
-      <w:pPr>
         <w:sectPr>
           <w:type w:val="nextPage"/>
           <w:pgSz w:w="9639" w:h="13608"/>
@@ -90,14 +84,12 @@
           <w:textDirection w:val="lrTb"/>
           <w:docGrid w:type="default" w:linePitch="360" w:charSpace="8192"/>
         </w:sectPr>
-        <w:pStyle w:val="Normal"/>
-        <w:rPr>
-          <w:lang w:val="en-US"/>
-        </w:rPr>
-      </w:pPr>
-      <w:r>
-        <w:rPr>
-          <w:lang w:val="en-US"/>
+      </w:pPr>
+      <w:r>
+        <w:rPr>
+          <w:rFonts w:cs="Servus Slab SemiBold" w:ascii="Exo 2" w:hAnsi="Exo 2"/>
+          <w:color w:val="FF0000"/>
+          <w:szCs w:val="20"/>
         </w:rPr>
       </w:r>
     </w:p>
@@ -872,19 +864,25 @@
         </w:rPr>
       </w:pPr>
       <w:r>
-        <w:rPr/>
-      </w:r>
-    </w:p>
-    <w:p>
-      <w:pPr>
-        <w:pStyle w:val="Normal"/>
         <w:rPr>
           <w:rFonts w:ascii="Exo 2" w:hAnsi="Exo 2"/>
           <w:szCs w:val="20"/>
         </w:rPr>
-      </w:pPr>
-      <w:r>
-        <w:rPr/>
+      </w:r>
+    </w:p>
+    <w:p>
+      <w:pPr>
+        <w:pStyle w:val="Normal"/>
+        <w:rPr>
+          <w:rFonts w:ascii="Exo 2" w:hAnsi="Exo 2"/>
+          <w:szCs w:val="20"/>
+        </w:rPr>
+      </w:pPr>
+      <w:r>
+        <w:rPr>
+          <w:rFonts w:ascii="Exo 2" w:hAnsi="Exo 2"/>
+          <w:szCs w:val="20"/>
+        </w:rPr>
       </w:r>
     </w:p>
     <w:p>
@@ -901,7 +899,7 @@
           <wp:inline distT="0" distB="0" distL="0" distR="0">
             <wp:extent cx="1979930" cy="334645"/>
             <wp:effectExtent l="0" t="0" r="0" b="0"/>
-            <wp:docPr id="1" name="Grafik 7" descr=""/>
+            <wp:docPr id="1" name="Grafik 7"/>
             <wp:cNvGraphicFramePr>
               <a:graphicFrameLocks xmlns:a="http://schemas.openxmlformats.org/drawingml/2006/main" noChangeAspect="1"/>
             </wp:cNvGraphicFramePr>
@@ -909,7 +907,7 @@
               <a:graphicData uri="http://schemas.openxmlformats.org/drawingml/2006/picture">
                 <pic:pic xmlns:pic="http://schemas.openxmlformats.org/drawingml/2006/picture">
                   <pic:nvPicPr>
-                    <pic:cNvPr id="1" name="Grafik 7" descr=""/>
+                    <pic:cNvPr id="1" name="Grafik 7"/>
                     <pic:cNvPicPr>
                       <a:picLocks noChangeAspect="1" noChangeArrowheads="1"/>
                     </pic:cNvPicPr>
@@ -928,6 +926,7 @@
                     <a:prstGeom prst="rect">
                       <a:avLst/>
                     </a:prstGeom>
+                    <a:noFill/>
                   </pic:spPr>
                 </pic:pic>
               </a:graphicData>
@@ -1355,15 +1354,12 @@
         </w:rPr>
       </w:pPr>
       <w:r>
-        <w:rPr>
-          <w:sz w:val="16"/>
-          <w:szCs w:val="16"/>
-        </w:rPr>
+        <w:rPr/>
         <w:drawing>
           <wp:inline distT="0" distB="0" distL="0" distR="0">
             <wp:extent cx="478155" cy="167640"/>
             <wp:effectExtent l="0" t="0" r="0" b="0"/>
-            <wp:docPr id="2" name="Grafik 2" descr=""/>
+            <wp:docPr id="2" name="Grafik 2"/>
             <wp:cNvGraphicFramePr>
               <a:graphicFrameLocks xmlns:a="http://schemas.openxmlformats.org/drawingml/2006/main" noChangeAspect="1"/>
             </wp:cNvGraphicFramePr>
@@ -1371,7 +1367,7 @@
               <a:graphicData uri="http://schemas.openxmlformats.org/drawingml/2006/picture">
                 <pic:pic xmlns:pic="http://schemas.openxmlformats.org/drawingml/2006/picture">
                   <pic:nvPicPr>
-                    <pic:cNvPr id="2" name="Grafik 2" descr=""/>
+                    <pic:cNvPr id="2" name="Grafik 2"/>
                     <pic:cNvPicPr>
                       <a:picLocks noChangeAspect="1" noChangeArrowheads="1"/>
                     </pic:cNvPicPr>
@@ -1396,6 +1392,7 @@
                     <a:prstGeom prst="rect">
                       <a:avLst/>
                     </a:prstGeom>
+                    <a:noFill/>
                   </pic:spPr>
                 </pic:pic>
               </a:graphicData>
@@ -1487,25 +1484,7 @@
           <w:sz w:val="16"/>
           <w:szCs w:val="16"/>
         </w:rPr>
-        <w:t xml:space="preserve"> </w:t>
-      </w:r>
-      <w:r>
-        <w:rPr>
-          <w:rFonts w:cs="Servus Slab" w:ascii="Exo 2" w:hAnsi="Exo 2"/>
-          <w:color w:val="auto"/>
-          <w:sz w:val="16"/>
-          <w:szCs w:val="16"/>
-        </w:rPr>
-        <w:t xml:space="preserve">Herausgeber*innen-Review und teilweise Peer-Review </w:t>
-      </w:r>
-      <w:r>
-        <w:rPr>
-          <w:rFonts w:cs="Servus Slab" w:ascii="Exo 2" w:hAnsi="Exo 2"/>
-          <w:color w:val="auto"/>
-          <w:sz w:val="16"/>
-          <w:szCs w:val="16"/>
-        </w:rPr>
-        <w:t>g</w:t>
+        <w:t xml:space="preserve"> Herausgeber*innen-Review und teilweise Peer-Review g</w:t>
       </w:r>
       <w:r>
         <w:rPr>
@@ -1594,17 +1573,7 @@
           <w:szCs w:val="16"/>
           <w:lang w:val="en-US"/>
         </w:rPr>
-        <w:t>https://orcid.org/</w:t>
-      </w:r>
-      <w:r>
-        <w:rPr>
-          <w:rFonts w:cs="Servus Slab" w:ascii="Exo 2" w:hAnsi="Exo 2"/>
-          <w:color w:val="auto"/>
-          <w:sz w:val="16"/>
-          <w:szCs w:val="16"/>
-          <w:lang w:val="en-US"/>
-        </w:rPr>
-        <w:t>0000-0001-7753-1078</w:t>
+        <w:t>https://orcid.org/0000-0001-7753-1078</w:t>
       </w:r>
     </w:p>
     <w:p>
@@ -1648,17 +1617,7 @@
           <w:szCs w:val="16"/>
           <w:lang w:val="en-US"/>
         </w:rPr>
-        <w:t>https://orcid.org/</w:t>
-      </w:r>
-      <w:r>
-        <w:rPr>
-          <w:rFonts w:cs="Servus Slab" w:ascii="Exo 2" w:hAnsi="Exo 2"/>
-          <w:color w:val="auto"/>
-          <w:sz w:val="16"/>
-          <w:szCs w:val="16"/>
-          <w:lang w:val="en-US"/>
-        </w:rPr>
-        <w:t>0000-0002-6567-0000</w:t>
+        <w:t>https://orcid.org/0000-0002-6567-0000</w:t>
       </w:r>
     </w:p>
     <w:p>
@@ -1702,17 +1661,7 @@
           <w:szCs w:val="16"/>
           <w:lang w:val="en-US"/>
         </w:rPr>
-        <w:t>https://orcid.org/</w:t>
-      </w:r>
-      <w:r>
-        <w:rPr>
-          <w:rFonts w:cs="Servus Slab" w:ascii="Exo 2" w:hAnsi="Exo 2"/>
-          <w:color w:val="auto"/>
-          <w:sz w:val="16"/>
-          <w:szCs w:val="16"/>
-          <w:lang w:val="en-US"/>
-        </w:rPr>
-        <w:t>0000-0003-0232-7085</w:t>
+        <w:t>https://orcid.org/0000-0003-0232-7085</w:t>
       </w:r>
     </w:p>
     <w:p>
@@ -1756,17 +1705,7 @@
           <w:szCs w:val="16"/>
           <w:lang w:val="en-US"/>
         </w:rPr>
-        <w:t>https://orcid.org/</w:t>
-      </w:r>
-      <w:r>
-        <w:rPr>
-          <w:rFonts w:cs="Servus Slab" w:ascii="Exo 2" w:hAnsi="Exo 2"/>
-          <w:color w:val="auto"/>
-          <w:sz w:val="16"/>
-          <w:szCs w:val="16"/>
-          <w:lang w:val="en-US"/>
-        </w:rPr>
-        <w:t>0000-0003-0602-8082</w:t>
+        <w:t>https://orcid.org/0000-0003-0602-8082</w:t>
       </w:r>
     </w:p>
     <w:p>
@@ -1810,17 +1749,7 @@
           <w:szCs w:val="16"/>
           <w:lang w:val="en-US"/>
         </w:rPr>
-        <w:t>https://orcid.org/</w:t>
-      </w:r>
-      <w:r>
-        <w:rPr>
-          <w:rFonts w:cs="Servus Slab" w:ascii="Exo 2" w:hAnsi="Exo 2"/>
-          <w:color w:val="auto"/>
-          <w:sz w:val="16"/>
-          <w:szCs w:val="16"/>
-          <w:lang w:val="en-US"/>
-        </w:rPr>
-        <w:t>0000-0002-7613-4123</w:t>
+        <w:t>https://orcid.org/0000-0002-7613-4123</w:t>
       </w:r>
     </w:p>
     <w:p>
@@ -1856,7 +1785,6 @@
           <w:szCs w:val="16"/>
         </w:rPr>
       </w:pPr>
-      <w:bookmarkStart w:id="1" w:name="_Hlk195779796"/>
       <w:r>
         <w:rPr>
           <w:rFonts w:cs="Servus Slab" w:ascii="Exo 2" w:hAnsi="Exo 2"/>
@@ -1866,7 +1794,7 @@
         </w:rPr>
         <w:t xml:space="preserve">ISBN </w:t>
       </w:r>
-      <w:bookmarkStart w:id="2" w:name="_Hlk195780125"/>
+      <w:bookmarkStart w:id="1" w:name="_Hlk195780125"/>
       <w:r>
         <w:rPr>
           <w:rFonts w:cs="Servus Slab" w:ascii="Exo 2" w:hAnsi="Exo 2"/>
@@ -1876,7 +1804,7 @@
         </w:rPr>
         <w:t>978-3-98781-</w:t>
       </w:r>
-      <w:bookmarkEnd w:id="2"/>
+      <w:bookmarkEnd w:id="1"/>
       <w:r>
         <w:rPr>
           <w:rFonts w:cs="Servus Slab" w:ascii="Exo 2" w:hAnsi="Exo 2"/>
@@ -1964,25 +1892,47 @@
           <w:szCs w:val="16"/>
         </w:rPr>
       </w:pPr>
-      <w:bookmarkStart w:id="3" w:name="_Hlk195779796"/>
-      <w:bookmarkStart w:id="4" w:name="_Hlk195780237"/>
-      <w:r>
-        <w:rPr>
-          <w:rFonts w:cs="Servus Slab" w:ascii="Exo 2" w:hAnsi="Exo 2"/>
-          <w:sz w:val="16"/>
-          <w:szCs w:val="16"/>
-        </w:rPr>
-        <w:t>https://doi.org/10.14279/depositonce-</w:t>
-      </w:r>
-      <w:bookmarkEnd w:id="3"/>
-      <w:bookmarkEnd w:id="4"/>
-      <w:r>
-        <w:rPr>
-          <w:rFonts w:cs="Servus Slab" w:ascii="Exo 2" w:hAnsi="Exo 2"/>
-          <w:sz w:val="16"/>
-          <w:szCs w:val="16"/>
-        </w:rPr>
-        <w:t>25167</w:t>
+      <w:hyperlink r:id="rId5">
+        <w:bookmarkStart w:id="2" w:name="_Hlk195780237"/>
+        <w:bookmarkStart w:id="3" w:name="_Hlk195779796"/>
+        <w:r>
+          <w:rPr>
+            <w:rStyle w:val="Hyperlink"/>
+            <w:rFonts w:cs="Servus Slab" w:ascii="Exo 2" w:hAnsi="Exo 2"/>
+            <w:sz w:val="16"/>
+            <w:szCs w:val="16"/>
+          </w:rPr>
+          <w:t>https://doi.org/10.14279/depositonce-</w:t>
+        </w:r>
+        <w:bookmarkEnd w:id="2"/>
+        <w:bookmarkEnd w:id="3"/>
+        <w:r>
+          <w:rPr>
+            <w:rStyle w:val="Hyperlink"/>
+            <w:rFonts w:cs="Servus Slab" w:ascii="Exo 2" w:hAnsi="Exo 2"/>
+            <w:sz w:val="16"/>
+            <w:szCs w:val="16"/>
+          </w:rPr>
+          <w:t>25167</w:t>
+        </w:r>
+      </w:hyperlink>
+    </w:p>
+    <w:p>
+      <w:pPr>
+        <w:pStyle w:val="Normal"/>
+        <w:spacing w:lineRule="auto" w:line="240"/>
+        <w:ind w:right="-142"/>
+        <w:rPr>
+          <w:sz w:val="16"/>
+          <w:szCs w:val="16"/>
+        </w:rPr>
+      </w:pPr>
+      <w:r>
+        <w:rPr>
+          <w:rFonts w:cs="Servus Slab" w:ascii="Exo 2" w:hAnsi="Exo 2"/>
+          <w:sz w:val="16"/>
+          <w:szCs w:val="16"/>
+        </w:rPr>
       </w:r>
     </w:p>
     <w:sectPr>
@@ -2420,7 +2370,7 @@
     <w:qFormat/>
     <w:rPr/>
   </w:style>
-  <w:style w:type="character" w:styleId="annotationreference">
+  <w:style w:type="character" w:styleId="CommentReference">
     <w:name w:val="annotation reference"/>
     <w:basedOn w:val="DefaultParagraphFont"/>
     <w:uiPriority w:val="99"/>
@@ -2500,7 +2450,7 @@
     </w:rPr>
   </w:style>
   <w:style w:type="paragraph" w:styleId="Caption">
-    <w:name w:val="Caption"/>
+    <w:name w:val="caption"/>
     <w:basedOn w:val="Normal"/>
     <w:qFormat/>
     <w:pPr>
@@ -2517,6 +2467,32 @@
   </w:style>
   <w:style w:type="paragraph" w:styleId="Verzeichnis">
     <w:name w:val="Verzeichnis"/>
+    <w:basedOn w:val="Normal"/>
+    <w:qFormat/>
+    <w:pPr>
+      <w:suppressLineNumbers/>
+    </w:pPr>
+    <w:rPr>
+      <w:rFonts w:cs="Noto Sans Devanagari"/>
+    </w:rPr>
+  </w:style>
+  <w:style w:type="paragraph" w:styleId="berschriftuser">
+    <w:name w:val="Überschrift (user)"/>
+    <w:basedOn w:val="Normal"/>
+    <w:next w:val="BodyText"/>
+    <w:qFormat/>
+    <w:pPr>
+      <w:keepNext w:val="true"/>
+      <w:spacing w:before="240" w:after="120"/>
+    </w:pPr>
+    <w:rPr>
+      <w:rFonts w:ascii="Liberation Sans" w:hAnsi="Liberation Sans" w:eastAsia="Noto Sans CJK SC" w:cs="Noto Sans Devanagari"/>
+      <w:sz w:val="28"/>
+      <w:szCs w:val="28"/>
+    </w:rPr>
+  </w:style>
+  <w:style w:type="paragraph" w:styleId="Verzeichnisuser">
+    <w:name w:val="Verzeichnis (user)"/>
     <w:basedOn w:val="Normal"/>
     <w:qFormat/>
     <w:pPr>
@@ -2558,8 +2534,8 @@
       <w:szCs w:val="24"/>
     </w:rPr>
   </w:style>
-  <w:style w:type="paragraph" w:styleId="AnnotationText">
-    <w:name w:val="Annotation Text"/>
+  <w:style w:type="paragraph" w:styleId="CommentText">
+    <w:name w:val="annotation text"/>
     <w:basedOn w:val="Normal"/>
     <w:link w:val="KommentartextZchn"/>
     <w:uiPriority w:val="99"/>
@@ -2577,12 +2553,13 @@
     <w:rsid w:val="00af70fc"/>
     <w:pPr>
       <w:widowControl/>
+      <w:suppressAutoHyphens w:val="true"/>
       <w:bidi w:val="0"/>
       <w:spacing w:before="0" w:after="0"/>
       <w:jc w:val="left"/>
     </w:pPr>
     <w:rPr>
-      <w:rFonts w:ascii="Calibri" w:hAnsi="Calibri" w:cs="Calibri" w:eastAsia="Calibri"/>
+      <w:rFonts w:ascii="Calibri" w:hAnsi="Calibri" w:eastAsia="Calibri" w:cs="Calibri"/>
       <w:color w:val="000000"/>
       <w:kern w:val="0"/>
       <w:sz w:val="24"/>
@@ -2606,8 +2583,8 @@
       <w14:ligatures w14:val="standardContextual"/>
     </w:rPr>
   </w:style>
-  <w:style w:type="numbering" w:styleId="KeineListe" w:default="1">
-    <w:name w:val="Keine Liste"/>
+  <w:style w:type="numbering" w:styleId="KeineListeuser" w:default="1">
+    <w:name w:val="Keine Liste (user)"/>
     <w:uiPriority w:val="99"/>
     <w:semiHidden/>
     <w:unhideWhenUsed/>

</xml_diff>